<commit_message>
Generate universal demo warehouse data
</commit_message>
<xml_diff>
--- a/ТЗ/Термины и определения.docx
+++ b/ТЗ/Термины и определения.docx
@@ -81,7 +81,7 @@
           <w:color w:val="14181C"/>
           <w:sz w:val="21"/>
         </w:rPr>
-        <w:t>Приложение к продуктовому ТЗ</w:t>
+        <w:t>Приложение к спецификации Simple WMS 0.1</w:t>
       </w:r>
     </w:p>
     <w:p>
@@ -172,7 +172,7 @@
         <w:rPr>
           <w:rFonts w:ascii="Arial" w:hAnsi="Arial" w:eastAsia="Arial"/>
         </w:rPr>
-        <w:t>Документ устанавливает единое значение терминов, используемых в продуктовом ТЗ, интерфейсе, API, документации и обсуждении доработок Simple WMS. Термины конкретного заказчика могут добавляться отдельным приложением без изменения общих понятий продукта.</w:t>
+        <w:t>Документ устанавливает единое значение терминов, используемых в спецификации, интерфейсе, API, документации и обсуждении доработок Simple WMS. Термины конкретного заказчика могут добавляться отдельным приложением без изменения общих понятий продукта.</w:t>
       </w:r>
     </w:p>
     <w:p>

</xml_diff>